<commit_message>
Added division of process in Q1.docx
</commit_message>
<xml_diff>
--- a/Assignment1/Q1.docx
+++ b/Assignment1/Q1.docx
@@ -172,6 +172,664 @@
           <w:szCs w:val="22"/>
         </w:rPr>
       </w:pPr>
+      <w:r>
+        <w:rPr>
+          <w:b/>
+          <w:bCs/>
+          <w:noProof/>
+          <w:sz w:val="28"/>
+          <w:szCs w:val="22"/>
+        </w:rPr>
+        <mc:AlternateContent>
+          <mc:Choice Requires="wps">
+            <w:drawing>
+              <wp:anchor distT="45720" distB="45720" distL="114300" distR="114300" simplePos="0" relativeHeight="251701248" behindDoc="0" locked="0" layoutInCell="1" allowOverlap="1" wp14:anchorId="2EE17192" wp14:editId="55F18C93">
+                <wp:simplePos x="0" y="0"/>
+                <wp:positionH relativeFrom="column">
+                  <wp:posOffset>28575</wp:posOffset>
+                </wp:positionH>
+                <wp:positionV relativeFrom="paragraph">
+                  <wp:posOffset>6463347</wp:posOffset>
+                </wp:positionV>
+                <wp:extent cx="775970" cy="333375"/>
+                <wp:effectExtent l="57150" t="38100" r="62230" b="85725"/>
+                <wp:wrapSquare wrapText="bothSides"/>
+                <wp:docPr id="265984732" name="Text Box 2"/>
+                <wp:cNvGraphicFramePr>
+                  <a:graphicFrameLocks xmlns:a="http://schemas.openxmlformats.org/drawingml/2006/main"/>
+                </wp:cNvGraphicFramePr>
+                <a:graphic xmlns:a="http://schemas.openxmlformats.org/drawingml/2006/main">
+                  <a:graphicData uri="http://schemas.microsoft.com/office/word/2010/wordprocessingShape">
+                    <wps:wsp>
+                      <wps:cNvSpPr txBox="1">
+                        <a:spLocks noChangeArrowheads="1"/>
+                      </wps:cNvSpPr>
+                      <wps:spPr bwMode="auto">
+                        <a:xfrm>
+                          <a:off x="0" y="0"/>
+                          <a:ext cx="775970" cy="333375"/>
+                        </a:xfrm>
+                        <a:prstGeom prst="rect">
+                          <a:avLst/>
+                        </a:prstGeom>
+                        <a:ln/>
+                      </wps:spPr>
+                      <wps:style>
+                        <a:lnRef idx="0">
+                          <a:schemeClr val="accent4"/>
+                        </a:lnRef>
+                        <a:fillRef idx="3">
+                          <a:schemeClr val="accent4"/>
+                        </a:fillRef>
+                        <a:effectRef idx="3">
+                          <a:schemeClr val="accent4"/>
+                        </a:effectRef>
+                        <a:fontRef idx="minor">
+                          <a:schemeClr val="lt1"/>
+                        </a:fontRef>
+                      </wps:style>
+                      <wps:txbx>
+                        <w:txbxContent>
+                          <w:p>
+                            <w:pPr>
+                              <w:rPr>
+                                <w:sz w:val="28"/>
+                                <w:szCs w:val="24"/>
+                              </w:rPr>
+                            </w:pPr>
+                            <w:r>
+                              <w:rPr>
+                                <w:sz w:val="28"/>
+                                <w:szCs w:val="24"/>
+                              </w:rPr>
+                              <w:t>Output</w:t>
+                            </w:r>
+                          </w:p>
+                        </w:txbxContent>
+                      </wps:txbx>
+                      <wps:bodyPr rot="0" vert="horz" wrap="square" lIns="91440" tIns="45720" rIns="91440" bIns="45720" anchor="t" anchorCtr="0">
+                        <a:noAutofit/>
+                      </wps:bodyPr>
+                    </wps:wsp>
+                  </a:graphicData>
+                </a:graphic>
+                <wp14:sizeRelH relativeFrom="margin">
+                  <wp14:pctWidth>0</wp14:pctWidth>
+                </wp14:sizeRelH>
+                <wp14:sizeRelV relativeFrom="margin">
+                  <wp14:pctHeight>0</wp14:pctHeight>
+                </wp14:sizeRelV>
+              </wp:anchor>
+            </w:drawing>
+          </mc:Choice>
+          <mc:Fallback>
+            <w:pict>
+              <v:shapetype w14:anchorId="2EE17192" id="_x0000_t202" coordsize="21600,21600" o:spt="202" path="m,l,21600r21600,l21600,xe">
+                <v:stroke joinstyle="miter"/>
+                <v:path gradientshapeok="t" o:connecttype="rect"/>
+              </v:shapetype>
+              <v:shape id="Text Box 2" o:spid="_x0000_s1027" type="#_x0000_t202" style="position:absolute;margin-left:2.25pt;margin-top:508.9pt;width:61.1pt;height:26.25pt;z-index:251701248;visibility:visible;mso-wrap-style:square;mso-width-percent:0;mso-height-percent:0;mso-wrap-distance-left:9pt;mso-wrap-distance-top:3.6pt;mso-wrap-distance-right:9pt;mso-wrap-distance-bottom:3.6pt;mso-position-horizontal:absolute;mso-position-horizontal-relative:text;mso-position-vertical:absolute;mso-position-vertical-relative:text;mso-width-percent:0;mso-height-percent:0;mso-width-relative:margin;mso-height-relative:margin;v-text-anchor:top" o:gfxdata="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" fillcolor="#10aae5 [3031]" stroked="f">
+                <v:fill color2="#0f9bd2 [3175]" rotate="t" colors="0 #47aadf;.5 #05a2df;1 #0094ce" focus="100%" type="gradient">
+                  <o:fill v:ext="view" type="gradientUnscaled"/>
+                </v:fill>
+                <v:shadow on="t" color="black" opacity="41287f" offset="0,1.5pt"/>
+                <v:textbox>
+                  <w:txbxContent>
+                    <w:p>
+                      <w:pPr>
+                        <w:rPr>
+                          <w:sz w:val="28"/>
+                          <w:szCs w:val="24"/>
+                        </w:rPr>
+                      </w:pPr>
+                      <w:r>
+                        <w:rPr>
+                          <w:sz w:val="28"/>
+                          <w:szCs w:val="24"/>
+                        </w:rPr>
+                        <w:t>Output</w:t>
+                      </w:r>
+                    </w:p>
+                  </w:txbxContent>
+                </v:textbox>
+                <w10:wrap type="square"/>
+              </v:shape>
+            </w:pict>
+          </mc:Fallback>
+        </mc:AlternateContent>
+      </w:r>
+      <w:r>
+        <w:rPr>
+          <w:b/>
+          <w:bCs/>
+          <w:noProof/>
+          <w:sz w:val="28"/>
+          <w:szCs w:val="22"/>
+        </w:rPr>
+        <mc:AlternateContent>
+          <mc:Choice Requires="wps">
+            <w:drawing>
+              <wp:anchor distT="0" distB="0" distL="114300" distR="114300" simplePos="0" relativeHeight="251695104" behindDoc="0" locked="0" layoutInCell="1" allowOverlap="1" wp14:anchorId="363FE838" wp14:editId="4A104B3D">
+                <wp:simplePos x="0" y="0"/>
+                <wp:positionH relativeFrom="column">
+                  <wp:posOffset>875982</wp:posOffset>
+                </wp:positionH>
+                <wp:positionV relativeFrom="paragraph">
+                  <wp:posOffset>6154103</wp:posOffset>
+                </wp:positionV>
+                <wp:extent cx="185737" cy="919163"/>
+                <wp:effectExtent l="0" t="0" r="24130" b="14605"/>
+                <wp:wrapNone/>
+                <wp:docPr id="899059347" name="Left Brace 22"/>
+                <wp:cNvGraphicFramePr/>
+                <a:graphic xmlns:a="http://schemas.openxmlformats.org/drawingml/2006/main">
+                  <a:graphicData uri="http://schemas.microsoft.com/office/word/2010/wordprocessingShape">
+                    <wps:wsp>
+                      <wps:cNvSpPr/>
+                      <wps:spPr>
+                        <a:xfrm>
+                          <a:off x="0" y="0"/>
+                          <a:ext cx="185737" cy="919163"/>
+                        </a:xfrm>
+                        <a:prstGeom prst="leftBrace">
+                          <a:avLst/>
+                        </a:prstGeom>
+                        <a:ln>
+                          <a:solidFill>
+                            <a:schemeClr val="accent4">
+                              <a:lumMod val="40000"/>
+                              <a:lumOff val="60000"/>
+                            </a:schemeClr>
+                          </a:solidFill>
+                        </a:ln>
+                      </wps:spPr>
+                      <wps:style>
+                        <a:lnRef idx="2">
+                          <a:schemeClr val="accent1"/>
+                        </a:lnRef>
+                        <a:fillRef idx="0">
+                          <a:schemeClr val="accent1"/>
+                        </a:fillRef>
+                        <a:effectRef idx="1">
+                          <a:schemeClr val="accent1"/>
+                        </a:effectRef>
+                        <a:fontRef idx="minor">
+                          <a:schemeClr val="tx1"/>
+                        </a:fontRef>
+                      </wps:style>
+                      <wps:bodyPr rot="0" spcFirstLastPara="0" vertOverflow="overflow" horzOverflow="overflow" vert="horz" wrap="square" lIns="91440" tIns="45720" rIns="91440" bIns="45720" numCol="1" spcCol="0" rtlCol="0" fromWordArt="0" anchor="ctr" anchorCtr="0" forceAA="0" compatLnSpc="1">
+                        <a:prstTxWarp prst="textNoShape">
+                          <a:avLst/>
+                        </a:prstTxWarp>
+                        <a:noAutofit/>
+                      </wps:bodyPr>
+                    </wps:wsp>
+                  </a:graphicData>
+                </a:graphic>
+                <wp14:sizeRelH relativeFrom="margin">
+                  <wp14:pctWidth>0</wp14:pctWidth>
+                </wp14:sizeRelH>
+                <wp14:sizeRelV relativeFrom="margin">
+                  <wp14:pctHeight>0</wp14:pctHeight>
+                </wp14:sizeRelV>
+              </wp:anchor>
+            </w:drawing>
+          </mc:Choice>
+          <mc:Fallback>
+            <w:pict>
+              <v:shapetype w14:anchorId="0B123F93" id="_x0000_t87" coordsize="21600,21600" o:spt="87" adj="1800,10800" path="m21600,qx10800@0l10800@2qy0@11,10800@3l10800@1qy21600,21600e" filled="f">
+                <v:formulas>
+                  <v:f eqn="val #0"/>
+                  <v:f eqn="sum 21600 0 #0"/>
+                  <v:f eqn="sum #1 0 #0"/>
+                  <v:f eqn="sum #1 #0 0"/>
+                  <v:f eqn="prod #0 9598 32768"/>
+                  <v:f eqn="sum 21600 0 @4"/>
+                  <v:f eqn="sum 21600 0 #1"/>
+                  <v:f eqn="min #1 @6"/>
+                  <v:f eqn="prod @7 1 2"/>
+                  <v:f eqn="prod #0 2 1"/>
+                  <v:f eqn="sum 21600 0 @9"/>
+                  <v:f eqn="val #1"/>
+                </v:formulas>
+                <v:path arrowok="t" o:connecttype="custom" o:connectlocs="21600,0;0,10800;21600,21600" textboxrect="13963,@4,21600,@5"/>
+                <v:handles>
+                  <v:h position="center,#0" yrange="0,@8"/>
+                  <v:h position="topLeft,#1" yrange="@9,@10"/>
+                </v:handles>
+              </v:shapetype>
+              <v:shape id="Left Brace 22" o:spid="_x0000_s1026" type="#_x0000_t87" style="position:absolute;margin-left:68.95pt;margin-top:484.6pt;width:14.6pt;height:72.4pt;z-index:251695104;visibility:visible;mso-wrap-style:square;mso-width-percent:0;mso-height-percent:0;mso-wrap-distance-left:9pt;mso-wrap-distance-top:0;mso-wrap-distance-right:9pt;mso-wrap-distance-bottom:0;mso-position-horizontal:absolute;mso-position-horizontal-relative:text;mso-position-vertical:absolute;mso-position-vertical-relative:text;mso-width-percent:0;mso-height-percent:0;mso-width-relative:margin;mso-height-relative:margin;v-text-anchor:middle" o:gfxdata="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" adj="364" strokecolor="#95dcf7 [1303]" strokeweight="1.5pt">
+                <v:stroke joinstyle="miter"/>
+              </v:shape>
+            </w:pict>
+          </mc:Fallback>
+        </mc:AlternateContent>
+      </w:r>
+      <w:r>
+        <w:rPr>
+          <w:b/>
+          <w:bCs/>
+          <w:noProof/>
+          <w:sz w:val="28"/>
+          <w:szCs w:val="22"/>
+        </w:rPr>
+        <mc:AlternateContent>
+          <mc:Choice Requires="wps">
+            <w:drawing>
+              <wp:anchor distT="45720" distB="45720" distL="114300" distR="114300" simplePos="0" relativeHeight="251703296" behindDoc="0" locked="0" layoutInCell="1" allowOverlap="1" wp14:anchorId="6519E72E" wp14:editId="7423BB07">
+                <wp:simplePos x="0" y="0"/>
+                <wp:positionH relativeFrom="column">
+                  <wp:posOffset>-371475</wp:posOffset>
+                </wp:positionH>
+                <wp:positionV relativeFrom="paragraph">
+                  <wp:posOffset>3601085</wp:posOffset>
+                </wp:positionV>
+                <wp:extent cx="1052195" cy="342900"/>
+                <wp:effectExtent l="57150" t="38100" r="52705" b="76200"/>
+                <wp:wrapSquare wrapText="bothSides"/>
+                <wp:docPr id="1536013831" name="Text Box 2"/>
+                <wp:cNvGraphicFramePr>
+                  <a:graphicFrameLocks xmlns:a="http://schemas.openxmlformats.org/drawingml/2006/main"/>
+                </wp:cNvGraphicFramePr>
+                <a:graphic xmlns:a="http://schemas.openxmlformats.org/drawingml/2006/main">
+                  <a:graphicData uri="http://schemas.microsoft.com/office/word/2010/wordprocessingShape">
+                    <wps:wsp>
+                      <wps:cNvSpPr txBox="1">
+                        <a:spLocks noChangeArrowheads="1"/>
+                      </wps:cNvSpPr>
+                      <wps:spPr bwMode="auto">
+                        <a:xfrm>
+                          <a:off x="0" y="0"/>
+                          <a:ext cx="1052195" cy="342900"/>
+                        </a:xfrm>
+                        <a:prstGeom prst="rect">
+                          <a:avLst/>
+                        </a:prstGeom>
+                        <a:ln>
+                          <a:headEnd/>
+                          <a:tailEnd/>
+                        </a:ln>
+                      </wps:spPr>
+                      <wps:style>
+                        <a:lnRef idx="0">
+                          <a:schemeClr val="accent6"/>
+                        </a:lnRef>
+                        <a:fillRef idx="3">
+                          <a:schemeClr val="accent6"/>
+                        </a:fillRef>
+                        <a:effectRef idx="3">
+                          <a:schemeClr val="accent6"/>
+                        </a:effectRef>
+                        <a:fontRef idx="minor">
+                          <a:schemeClr val="lt1"/>
+                        </a:fontRef>
+                      </wps:style>
+                      <wps:txbx>
+                        <w:txbxContent>
+                          <w:p>
+                            <w:pPr>
+                              <w:rPr>
+                                <w:sz w:val="28"/>
+                                <w:szCs w:val="24"/>
+                              </w:rPr>
+                            </w:pPr>
+                            <w:r>
+                              <w:rPr>
+                                <w:sz w:val="28"/>
+                                <w:szCs w:val="24"/>
+                              </w:rPr>
+                              <w:t>Processing</w:t>
+                            </w:r>
+                          </w:p>
+                        </w:txbxContent>
+                      </wps:txbx>
+                      <wps:bodyPr rot="0" vert="horz" wrap="square" lIns="91440" tIns="45720" rIns="91440" bIns="45720" anchor="t" anchorCtr="0">
+                        <a:noAutofit/>
+                      </wps:bodyPr>
+                    </wps:wsp>
+                  </a:graphicData>
+                </a:graphic>
+                <wp14:sizeRelH relativeFrom="margin">
+                  <wp14:pctWidth>0</wp14:pctWidth>
+                </wp14:sizeRelH>
+                <wp14:sizeRelV relativeFrom="margin">
+                  <wp14:pctHeight>0</wp14:pctHeight>
+                </wp14:sizeRelV>
+              </wp:anchor>
+            </w:drawing>
+          </mc:Choice>
+          <mc:Fallback>
+            <w:pict>
+              <v:shape w14:anchorId="6519E72E" id="_x0000_s1028" type="#_x0000_t202" style="position:absolute;margin-left:-29.25pt;margin-top:283.55pt;width:82.85pt;height:27pt;z-index:251703296;visibility:visible;mso-wrap-style:square;mso-width-percent:0;mso-height-percent:0;mso-wrap-distance-left:9pt;mso-wrap-distance-top:3.6pt;mso-wrap-distance-right:9pt;mso-wrap-distance-bottom:3.6pt;mso-position-horizontal:absolute;mso-position-horizontal-relative:text;mso-position-vertical:absolute;mso-position-vertical-relative:text;mso-width-percent:0;mso-height-percent:0;mso-width-relative:margin;mso-height-relative:margin;v-text-anchor:top" o:gfxdata="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" fillcolor="#54b532 [3033]" stroked="f">
+                <v:fill color2="#4ca42d [3177]" rotate="t" colors="0 #66b352;.5 #4bad28;1 #3f9e1d" focus="100%" type="gradient">
+                  <o:fill v:ext="view" type="gradientUnscaled"/>
+                </v:fill>
+                <v:shadow on="t" color="black" opacity="41287f" offset="0,1.5pt"/>
+                <v:textbox>
+                  <w:txbxContent>
+                    <w:p>
+                      <w:pPr>
+                        <w:rPr>
+                          <w:sz w:val="28"/>
+                          <w:szCs w:val="24"/>
+                        </w:rPr>
+                      </w:pPr>
+                      <w:r>
+                        <w:rPr>
+                          <w:sz w:val="28"/>
+                          <w:szCs w:val="24"/>
+                        </w:rPr>
+                        <w:t>Processing</w:t>
+                      </w:r>
+                    </w:p>
+                  </w:txbxContent>
+                </v:textbox>
+                <w10:wrap type="square"/>
+              </v:shape>
+            </w:pict>
+          </mc:Fallback>
+        </mc:AlternateContent>
+      </w:r>
+      <w:r>
+        <w:rPr>
+          <w:b/>
+          <w:bCs/>
+          <w:noProof/>
+          <w:sz w:val="28"/>
+          <w:szCs w:val="22"/>
+        </w:rPr>
+        <mc:AlternateContent>
+          <mc:Choice Requires="wps">
+            <w:drawing>
+              <wp:anchor distT="45720" distB="45720" distL="114300" distR="114300" simplePos="0" relativeHeight="251699200" behindDoc="0" locked="0" layoutInCell="1" allowOverlap="1" wp14:anchorId="3554282C" wp14:editId="019303F4">
+                <wp:simplePos x="0" y="0"/>
+                <wp:positionH relativeFrom="margin">
+                  <wp:posOffset>28575</wp:posOffset>
+                </wp:positionH>
+                <wp:positionV relativeFrom="paragraph">
+                  <wp:posOffset>891540</wp:posOffset>
+                </wp:positionV>
+                <wp:extent cx="633095" cy="299720"/>
+                <wp:effectExtent l="57150" t="38100" r="52705" b="81280"/>
+                <wp:wrapSquare wrapText="bothSides"/>
+                <wp:docPr id="896388415" name="Text Box 2"/>
+                <wp:cNvGraphicFramePr>
+                  <a:graphicFrameLocks xmlns:a="http://schemas.openxmlformats.org/drawingml/2006/main"/>
+                </wp:cNvGraphicFramePr>
+                <a:graphic xmlns:a="http://schemas.openxmlformats.org/drawingml/2006/main">
+                  <a:graphicData uri="http://schemas.microsoft.com/office/word/2010/wordprocessingShape">
+                    <wps:wsp>
+                      <wps:cNvSpPr txBox="1">
+                        <a:spLocks noChangeArrowheads="1"/>
+                      </wps:cNvSpPr>
+                      <wps:spPr bwMode="auto">
+                        <a:xfrm>
+                          <a:off x="0" y="0"/>
+                          <a:ext cx="633095" cy="299720"/>
+                        </a:xfrm>
+                        <a:prstGeom prst="rect">
+                          <a:avLst/>
+                        </a:prstGeom>
+                        <a:ln>
+                          <a:headEnd/>
+                          <a:tailEnd/>
+                        </a:ln>
+                      </wps:spPr>
+                      <wps:style>
+                        <a:lnRef idx="0">
+                          <a:schemeClr val="accent5"/>
+                        </a:lnRef>
+                        <a:fillRef idx="3">
+                          <a:schemeClr val="accent5"/>
+                        </a:fillRef>
+                        <a:effectRef idx="3">
+                          <a:schemeClr val="accent5"/>
+                        </a:effectRef>
+                        <a:fontRef idx="minor">
+                          <a:schemeClr val="lt1"/>
+                        </a:fontRef>
+                      </wps:style>
+                      <wps:txbx>
+                        <w:txbxContent>
+                          <w:p>
+                            <w:pPr>
+                              <w:rPr>
+                                <w:sz w:val="28"/>
+                                <w:szCs w:val="24"/>
+                              </w:rPr>
+                            </w:pPr>
+                            <w:r>
+                              <w:rPr>
+                                <w:sz w:val="28"/>
+                                <w:szCs w:val="24"/>
+                              </w:rPr>
+                              <w:t>Input</w:t>
+                            </w:r>
+                          </w:p>
+                        </w:txbxContent>
+                      </wps:txbx>
+                      <wps:bodyPr rot="0" vert="horz" wrap="square" lIns="91440" tIns="45720" rIns="91440" bIns="45720" anchor="t" anchorCtr="0">
+                        <a:noAutofit/>
+                      </wps:bodyPr>
+                    </wps:wsp>
+                  </a:graphicData>
+                </a:graphic>
+                <wp14:sizeRelH relativeFrom="margin">
+                  <wp14:pctWidth>0</wp14:pctWidth>
+                </wp14:sizeRelH>
+                <wp14:sizeRelV relativeFrom="margin">
+                  <wp14:pctHeight>0</wp14:pctHeight>
+                </wp14:sizeRelV>
+              </wp:anchor>
+            </w:drawing>
+          </mc:Choice>
+          <mc:Fallback>
+            <w:pict>
+              <v:shape w14:anchorId="3554282C" id="_x0000_s1029" type="#_x0000_t202" style="position:absolute;margin-left:2.25pt;margin-top:70.2pt;width:49.85pt;height:23.6pt;z-index:251699200;visibility:visible;mso-wrap-style:square;mso-width-percent:0;mso-height-percent:0;mso-wrap-distance-left:9pt;mso-wrap-distance-top:3.6pt;mso-wrap-distance-right:9pt;mso-wrap-distance-bottom:3.6pt;mso-position-horizontal:absolute;mso-position-horizontal-relative:margin;mso-position-vertical:absolute;mso-position-vertical-relative:text;mso-width-percent:0;mso-height-percent:0;mso-width-relative:margin;mso-height-relative:margin;v-text-anchor:top" o:gfxdata="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" fillcolor="#ae2fa0 [3032]" stroked="f">
+                <v:fill color2="#9d2a90 [3176]" rotate="t" colors="0 #ac51a0;.5 #a62598;1 #981b8a" focus="100%" type="gradient">
+                  <o:fill v:ext="view" type="gradientUnscaled"/>
+                </v:fill>
+                <v:shadow on="t" color="black" opacity="41287f" offset="0,1.5pt"/>
+                <v:textbox>
+                  <w:txbxContent>
+                    <w:p>
+                      <w:pPr>
+                        <w:rPr>
+                          <w:sz w:val="28"/>
+                          <w:szCs w:val="24"/>
+                        </w:rPr>
+                      </w:pPr>
+                      <w:r>
+                        <w:rPr>
+                          <w:sz w:val="28"/>
+                          <w:szCs w:val="24"/>
+                        </w:rPr>
+                        <w:t>Input</w:t>
+                      </w:r>
+                    </w:p>
+                  </w:txbxContent>
+                </v:textbox>
+                <w10:wrap type="square" anchorx="margin"/>
+              </v:shape>
+            </w:pict>
+          </mc:Fallback>
+        </mc:AlternateContent>
+      </w:r>
+      <w:r>
+        <w:rPr>
+          <w:b/>
+          <w:bCs/>
+          <w:noProof/>
+          <w:sz w:val="28"/>
+          <w:szCs w:val="22"/>
+        </w:rPr>
+        <mc:AlternateContent>
+          <mc:Choice Requires="wps">
+            <w:drawing>
+              <wp:anchor distT="0" distB="0" distL="114300" distR="114300" simplePos="0" relativeHeight="251693056" behindDoc="0" locked="0" layoutInCell="1" allowOverlap="1" wp14:anchorId="1713BFC6" wp14:editId="357867A4">
+                <wp:simplePos x="0" y="0"/>
+                <wp:positionH relativeFrom="column">
+                  <wp:posOffset>762000</wp:posOffset>
+                </wp:positionH>
+                <wp:positionV relativeFrom="paragraph">
+                  <wp:posOffset>615315</wp:posOffset>
+                </wp:positionV>
+                <wp:extent cx="209550" cy="814388"/>
+                <wp:effectExtent l="0" t="0" r="19050" b="24130"/>
+                <wp:wrapNone/>
+                <wp:docPr id="520312518" name="Left Brace 22"/>
+                <wp:cNvGraphicFramePr/>
+                <a:graphic xmlns:a="http://schemas.openxmlformats.org/drawingml/2006/main">
+                  <a:graphicData uri="http://schemas.microsoft.com/office/word/2010/wordprocessingShape">
+                    <wps:wsp>
+                      <wps:cNvSpPr/>
+                      <wps:spPr>
+                        <a:xfrm>
+                          <a:off x="0" y="0"/>
+                          <a:ext cx="209550" cy="814388"/>
+                        </a:xfrm>
+                        <a:prstGeom prst="leftBrace">
+                          <a:avLst>
+                            <a:gd name="adj1" fmla="val 0"/>
+                            <a:gd name="adj2" fmla="val 50000"/>
+                          </a:avLst>
+                        </a:prstGeom>
+                        <a:ln>
+                          <a:solidFill>
+                            <a:schemeClr val="accent5">
+                              <a:lumMod val="40000"/>
+                              <a:lumOff val="60000"/>
+                            </a:schemeClr>
+                          </a:solidFill>
+                        </a:ln>
+                      </wps:spPr>
+                      <wps:style>
+                        <a:lnRef idx="2">
+                          <a:schemeClr val="accent1"/>
+                        </a:lnRef>
+                        <a:fillRef idx="0">
+                          <a:schemeClr val="accent1"/>
+                        </a:fillRef>
+                        <a:effectRef idx="1">
+                          <a:schemeClr val="accent1"/>
+                        </a:effectRef>
+                        <a:fontRef idx="minor">
+                          <a:schemeClr val="tx1"/>
+                        </a:fontRef>
+                      </wps:style>
+                      <wps:bodyPr rot="0" spcFirstLastPara="0" vertOverflow="overflow" horzOverflow="overflow" vert="horz" wrap="square" lIns="91440" tIns="45720" rIns="91440" bIns="45720" numCol="1" spcCol="0" rtlCol="0" fromWordArt="0" anchor="ctr" anchorCtr="0" forceAA="0" compatLnSpc="1">
+                        <a:prstTxWarp prst="textNoShape">
+                          <a:avLst/>
+                        </a:prstTxWarp>
+                        <a:noAutofit/>
+                      </wps:bodyPr>
+                    </wps:wsp>
+                  </a:graphicData>
+                </a:graphic>
+                <wp14:sizeRelH relativeFrom="margin">
+                  <wp14:pctWidth>0</wp14:pctWidth>
+                </wp14:sizeRelH>
+                <wp14:sizeRelV relativeFrom="margin">
+                  <wp14:pctHeight>0</wp14:pctHeight>
+                </wp14:sizeRelV>
+              </wp:anchor>
+            </w:drawing>
+          </mc:Choice>
+          <mc:Fallback>
+            <w:pict>
+              <v:shape w14:anchorId="1C1D1478" id="Left Brace 22" o:spid="_x0000_s1026" type="#_x0000_t87" style="position:absolute;margin-left:60pt;margin-top:48.45pt;width:16.5pt;height:64.15pt;z-index:251693056;visibility:visible;mso-wrap-style:square;mso-width-percent:0;mso-height-percent:0;mso-wrap-distance-left:9pt;mso-wrap-distance-top:0;mso-wrap-distance-right:9pt;mso-wrap-distance-bottom:0;mso-position-horizontal:absolute;mso-position-horizontal-relative:text;mso-position-vertical:absolute;mso-position-vertical-relative:text;mso-width-percent:0;mso-height-percent:0;mso-width-relative:margin;mso-height-relative:margin;v-text-anchor:middle" o:gfxdata="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" adj="0" strokecolor="#e59edc [1304]" strokeweight="1.5pt">
+                <v:stroke joinstyle="miter"/>
+              </v:shape>
+            </w:pict>
+          </mc:Fallback>
+        </mc:AlternateContent>
+      </w:r>
+      <w:r>
+        <w:rPr>
+          <w:b/>
+          <w:bCs/>
+          <w:noProof/>
+          <w:sz w:val="28"/>
+          <w:szCs w:val="22"/>
+        </w:rPr>
+        <mc:AlternateContent>
+          <mc:Choice Requires="wps">
+            <w:drawing>
+              <wp:anchor distT="0" distB="0" distL="114300" distR="114300" simplePos="0" relativeHeight="251697152" behindDoc="0" locked="0" layoutInCell="1" allowOverlap="1" wp14:anchorId="10F76EAA" wp14:editId="566FDE3E">
+                <wp:simplePos x="0" y="0"/>
+                <wp:positionH relativeFrom="column">
+                  <wp:posOffset>695325</wp:posOffset>
+                </wp:positionH>
+                <wp:positionV relativeFrom="paragraph">
+                  <wp:posOffset>1648460</wp:posOffset>
+                </wp:positionV>
+                <wp:extent cx="381000" cy="4214495"/>
+                <wp:effectExtent l="0" t="0" r="19050" b="14605"/>
+                <wp:wrapNone/>
+                <wp:docPr id="851637887" name="Left Brace 22"/>
+                <wp:cNvGraphicFramePr/>
+                <a:graphic xmlns:a="http://schemas.openxmlformats.org/drawingml/2006/main">
+                  <a:graphicData uri="http://schemas.microsoft.com/office/word/2010/wordprocessingShape">
+                    <wps:wsp>
+                      <wps:cNvSpPr/>
+                      <wps:spPr>
+                        <a:xfrm>
+                          <a:off x="0" y="0"/>
+                          <a:ext cx="381000" cy="4214495"/>
+                        </a:xfrm>
+                        <a:prstGeom prst="leftBrace">
+                          <a:avLst/>
+                        </a:prstGeom>
+                        <a:ln>
+                          <a:solidFill>
+                            <a:schemeClr val="accent3">
+                              <a:lumMod val="40000"/>
+                              <a:lumOff val="60000"/>
+                            </a:schemeClr>
+                          </a:solidFill>
+                        </a:ln>
+                      </wps:spPr>
+                      <wps:style>
+                        <a:lnRef idx="2">
+                          <a:schemeClr val="accent1"/>
+                        </a:lnRef>
+                        <a:fillRef idx="0">
+                          <a:schemeClr val="accent1"/>
+                        </a:fillRef>
+                        <a:effectRef idx="1">
+                          <a:schemeClr val="accent1"/>
+                        </a:effectRef>
+                        <a:fontRef idx="minor">
+                          <a:schemeClr val="tx1"/>
+                        </a:fontRef>
+                      </wps:style>
+                      <wps:bodyPr rot="0" spcFirstLastPara="0" vertOverflow="overflow" horzOverflow="overflow" vert="horz" wrap="square" lIns="91440" tIns="45720" rIns="91440" bIns="45720" numCol="1" spcCol="0" rtlCol="0" fromWordArt="0" anchor="ctr" anchorCtr="0" forceAA="0" compatLnSpc="1">
+                        <a:prstTxWarp prst="textNoShape">
+                          <a:avLst/>
+                        </a:prstTxWarp>
+                        <a:noAutofit/>
+                      </wps:bodyPr>
+                    </wps:wsp>
+                  </a:graphicData>
+                </a:graphic>
+                <wp14:sizeRelH relativeFrom="margin">
+                  <wp14:pctWidth>0</wp14:pctWidth>
+                </wp14:sizeRelH>
+                <wp14:sizeRelV relativeFrom="margin">
+                  <wp14:pctHeight>0</wp14:pctHeight>
+                </wp14:sizeRelV>
+              </wp:anchor>
+            </w:drawing>
+          </mc:Choice>
+          <mc:Fallback>
+            <w:pict>
+              <v:shape w14:anchorId="76020F5D" id="Left Brace 22" o:spid="_x0000_s1026" type="#_x0000_t87" style="position:absolute;margin-left:54.75pt;margin-top:129.8pt;width:30pt;height:331.85pt;z-index:251697152;visibility:visible;mso-wrap-style:square;mso-width-percent:0;mso-height-percent:0;mso-wrap-distance-left:9pt;mso-wrap-distance-top:0;mso-wrap-distance-right:9pt;mso-wrap-distance-bottom:0;mso-position-horizontal:absolute;mso-position-horizontal-relative:text;mso-position-vertical:absolute;mso-position-vertical-relative:text;mso-width-percent:0;mso-height-percent:0;mso-width-relative:margin;mso-height-relative:margin;v-text-anchor:middle" o:gfxdata="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" adj="163" strokecolor="#84e290 [1302]" strokeweight="1.5pt">
+                <v:stroke joinstyle="miter"/>
+              </v:shape>
+            </w:pict>
+          </mc:Fallback>
+        </mc:AlternateContent>
+      </w:r>
       <w:r>
         <w:rPr>
           <w:b/>
@@ -1832,37 +2490,7 @@
                                 <w:color w:val="262626" w:themeColor="text1" w:themeTint="D9"/>
                                 <w:szCs w:val="20"/>
                               </w:rPr>
-                              <w:t>Binary:</w:t>
-                            </w:r>
-                            <w:r>
-                              <w:rPr>
-                                <w:rFonts w:ascii="Times New Roman" w:hAnsi="Times New Roman" w:cs="Times New Roman"/>
-                                <w:i/>
-                                <w:iCs/>
-                                <w:color w:val="262626" w:themeColor="text1" w:themeTint="D9"/>
-                                <w:szCs w:val="20"/>
-                              </w:rPr>
-                              <w:t xml:space="preserve"> </w:t>
-                            </w:r>
-                            <w:r>
-                              <w:rPr>
-                                <w:rFonts w:ascii="Times New Roman" w:hAnsi="Times New Roman" w:cs="Times New Roman"/>
-                                <w:i/>
-                                <w:iCs/>
-                                <w:color w:val="262626" w:themeColor="text1" w:themeTint="D9"/>
-                                <w:szCs w:val="20"/>
-                              </w:rPr>
-                              <w:t>10010101 0101101</w:t>
-                            </w:r>
-                            <w:r>
-                              <w:rPr>
-                                <w:rFonts w:ascii="Times New Roman" w:hAnsi="Times New Roman" w:cs="Times New Roman"/>
-                                <w:i/>
-                                <w:iCs/>
-                                <w:color w:val="262626" w:themeColor="text1" w:themeTint="D9"/>
-                                <w:szCs w:val="20"/>
-                              </w:rPr>
-                              <w:t>0</w:t>
+                              <w:t>Binary: 10010101 01011010</w:t>
                             </w:r>
                           </w:p>
                         </w:txbxContent>
@@ -2063,47 +2691,7 @@
                                 <w:sz w:val="28"/>
                                 <w:szCs w:val="22"/>
                               </w:rPr>
-                              <w:t>P</w:t>
-                            </w:r>
-                            <w:r>
-                              <w:rPr>
-                                <w:rFonts w:ascii="Times New Roman" w:hAnsi="Times New Roman" w:cs="Times New Roman"/>
-                                <w:sz w:val="28"/>
-                                <w:szCs w:val="22"/>
-                              </w:rPr>
-                              <w:t xml:space="preserve">ython </w:t>
-                            </w:r>
-                            <w:r>
-                              <w:rPr>
-                                <w:rFonts w:ascii="Times New Roman" w:hAnsi="Times New Roman" w:cs="Times New Roman"/>
-                                <w:sz w:val="28"/>
-                                <w:szCs w:val="22"/>
-                              </w:rPr>
-                              <w:t>V</w:t>
-                            </w:r>
-                            <w:r>
-                              <w:rPr>
-                                <w:rFonts w:ascii="Times New Roman" w:hAnsi="Times New Roman" w:cs="Times New Roman"/>
-                                <w:sz w:val="28"/>
-                                <w:szCs w:val="22"/>
-                              </w:rPr>
-                              <w:t xml:space="preserve">irtual </w:t>
-                            </w:r>
-                            <w:r>
-                              <w:rPr>
-                                <w:rFonts w:ascii="Times New Roman" w:hAnsi="Times New Roman" w:cs="Times New Roman"/>
-                                <w:sz w:val="28"/>
-                                <w:szCs w:val="22"/>
-                              </w:rPr>
-                              <w:t>M</w:t>
-                            </w:r>
-                            <w:r>
-                              <w:rPr>
-                                <w:rFonts w:ascii="Times New Roman" w:hAnsi="Times New Roman" w:cs="Times New Roman"/>
-                                <w:sz w:val="28"/>
-                                <w:szCs w:val="22"/>
-                              </w:rPr>
-                              <w:t>achine</w:t>
+                              <w:t>Python Virtual Machine</w:t>
                             </w:r>
                           </w:p>
                           <w:p>
@@ -2312,15 +2900,7 @@
                                 <w:sz w:val="28"/>
                                 <w:szCs w:val="22"/>
                               </w:rPr>
-                              <w:t>Is s</w:t>
-                            </w:r>
-                            <w:r>
-                              <w:rPr>
-                                <w:color w:val="262626" w:themeColor="text1" w:themeTint="D9"/>
-                                <w:sz w:val="28"/>
-                                <w:szCs w:val="22"/>
-                              </w:rPr>
-                              <w:t>yntax correct?</w:t>
+                              <w:t>Is syntax correct?</w:t>
                             </w:r>
                           </w:p>
                         </w:txbxContent>

</xml_diff>